<commit_message>
organización de archivos y prompts
</commit_message>
<xml_diff>
--- a/deliverables/Manual_de_uso.docx
+++ b/deliverables/Manual_de_uso.docx
@@ -15045,6 +15045,86 @@
           </w:p>
         </w:tc>
       </w:tr>
+      <w:tr>
+        <w:trPr>
+          <w:cantSplit w:val="true"/>
+        </w:trPr>
+        <w:tc>
+          <w:tcPr>
+            <w:tcW w:type="dxa" w:w="3324"/>
+            <w:vAlign w:val="center"/>
+            <w:tcMar>
+              <w:top w:w="90" w:type="dxa"/>
+              <w:start w:w="110" w:type="dxa"/>
+              <w:bottom w:w="90" w:type="dxa"/>
+              <w:end w:w="110" w:type="dxa"/>
+            </w:tcMar>
+            <w:shd w:fill="FFFFFF"/>
+          </w:tcPr>
+          <w:p>
+            <w:pPr>
+              <w:spacing w:after="0"/>
+            </w:pPr>
+            <w:r>
+              <w:rPr>
+                <w:rFonts w:ascii="Aptos" w:hAnsi="Aptos"/>
+                <w:sz w:val="16"/>
+              </w:rPr>
+              <w:t>TOKEN-006 / LAYOUT-TOKEN-008</w:t>
+            </w:r>
+          </w:p>
+        </w:tc>
+        <w:tc>
+          <w:tcPr>
+            <w:tcW w:type="dxa" w:w="3324"/>
+            <w:vAlign w:val="center"/>
+            <w:tcMar>
+              <w:top w:w="90" w:type="dxa"/>
+              <w:start w:w="110" w:type="dxa"/>
+              <w:bottom w:w="90" w:type="dxa"/>
+              <w:end w:w="110" w:type="dxa"/>
+            </w:tcMar>
+            <w:shd w:fill="FFFFFF"/>
+          </w:tcPr>
+          <w:p>
+            <w:pPr>
+              <w:spacing w:after="0"/>
+            </w:pPr>
+            <w:r>
+              <w:rPr>
+                <w:rFonts w:ascii="Aptos" w:hAnsi="Aptos"/>
+                <w:sz w:val="16"/>
+              </w:rPr>
+              <w:t>Marcador sin completar ({{FIELD:}}, {{COLUMN:}}, {{SUM:}}), típico de una plantilla generada con la IA</w:t>
+            </w:r>
+          </w:p>
+        </w:tc>
+        <w:tc>
+          <w:tcPr>
+            <w:tcW w:type="dxa" w:w="3324"/>
+            <w:vAlign w:val="center"/>
+            <w:tcMar>
+              <w:top w:w="90" w:type="dxa"/>
+              <w:start w:w="110" w:type="dxa"/>
+              <w:bottom w:w="90" w:type="dxa"/>
+              <w:end w:w="110" w:type="dxa"/>
+            </w:tcMar>
+            <w:shd w:fill="FFFFFF"/>
+          </w:tcPr>
+          <w:p>
+            <w:pPr>
+              <w:spacing w:after="0"/>
+            </w:pPr>
+            <w:r>
+              <w:rPr>
+                <w:rFonts w:ascii="Aptos" w:hAnsi="Aptos"/>
+                <w:sz w:val="16"/>
+              </w:rPr>
+              <w:t>Escribir el nombre: ALIAS o NOMBRE en modo simple, CONSULTA.COLUMNA en modo layout</w:t>
+            </w:r>
+          </w:p>
+        </w:tc>
+      </w:tr>
     </w:tbl>
     <w:p>
       <w:pPr>
@@ -16766,6 +16846,55 @@
       <w:pPr>
         <w:spacing w:after="20"/>
       </w:pPr>
+    </w:p>
+    <w:p>
+      <w:r>
+        <w:t xml:space="preserve">La primera versión del Word puede generarse con el prompt </w:t>
+      </w:r>
+      <w:r>
+        <w:rPr>
+          <w:rFonts w:ascii="Consolas" w:hAnsi="Consolas"/>
+          <w:color w:val="233648"/>
+          <w:sz w:val="16"/>
+        </w:rPr>
+        <w:t>docs\PROMPT_IA_PLANTILLA.txt</w:t>
+      </w:r>
+      <w:r>
+        <w:t xml:space="preserve"> a partir de capturas del reporte original. La IA deja vacíos </w:t>
+      </w:r>
+      <w:r>
+        <w:rPr>
+          <w:rFonts w:ascii="Consolas" w:hAnsi="Consolas"/>
+          <w:color w:val="233648"/>
+          <w:sz w:val="16"/>
+        </w:rPr>
+        <w:t>{{FIELD:}}</w:t>
+      </w:r>
+      <w:r>
+        <w:t xml:space="preserve">, </w:t>
+      </w:r>
+      <w:r>
+        <w:rPr>
+          <w:rFonts w:ascii="Consolas" w:hAnsi="Consolas"/>
+          <w:color w:val="233648"/>
+          <w:sz w:val="16"/>
+        </w:rPr>
+        <w:t>{{COLUMN:}}</w:t>
+      </w:r>
+      <w:r>
+        <w:t xml:space="preserve"> y </w:t>
+      </w:r>
+      <w:r>
+        <w:rPr>
+          <w:rFonts w:ascii="Consolas" w:hAnsi="Consolas"/>
+          <w:color w:val="233648"/>
+          <w:sz w:val="16"/>
+        </w:rPr>
+        <w:t>{{SUM:}}</w:t>
+      </w:r>
+      <w:r>
+        <w:t>: Informática los completa en Word con CONSULTA.COLUMNA; la validación lista cada marcador pendiente con su tabla, fila y columna (LAYOUT-TOKEN-008).</w:t>
+      </w:r>
     </w:p>
     <w:p>
       <w:r>

</xml_diff>

<commit_message>
fix: overlap de texto + update de manual de uso
</commit_message>
<xml_diff>
--- a/deliverables/Manual_de_uso.docx
+++ b/deliverables/Manual_de_uso.docx
@@ -4828,7 +4828,7 @@
                 <w:rFonts w:ascii="Aptos" w:hAnsi="Aptos"/>
                 <w:sz w:val="16"/>
               </w:rPr>
-              <w:t>Validar</w:t>
+              <w:t>Actualizar Word…</w:t>
             </w:r>
           </w:p>
         </w:tc>
@@ -4854,7 +4854,22 @@
                 <w:rFonts w:ascii="Aptos" w:hAnsi="Aptos"/>
                 <w:sz w:val="16"/>
               </w:rPr>
-              <w:t>Revisa DOCX, SQL y proyecto sin escribir archivos y, si es válido, muestra los mismos pasos de APEX que Compilar y activa «Copiar código APEX».</w:t>
+              <w:t xml:space="preserve">Reemplaza </w:t>
+            </w:r>
+            <w:r>
+              <w:rPr>
+                <w:rFonts w:ascii="Aptos" w:hAnsi="Aptos"/>
+                <w:b/>
+                <w:sz w:val="16"/>
+              </w:rPr>
+              <w:t>solo</w:t>
+            </w:r>
+            <w:r>
+              <w:rPr>
+                <w:rFonts w:ascii="Aptos" w:hAnsi="Aptos"/>
+                <w:sz w:val="16"/>
+              </w:rPr>
+              <w:t xml:space="preserve"> la plantilla Word del proyecto seleccionado (la anterior queda como .bak) y conserva todo lo ajustado: Page Items, título, constantes, los q_*.sql con el esquema/DB link de sus tablas y las fórmulas corregidas. Si el Word nuevo usa datos que el proyecto no tenía, agrega la consulta (con su SQL de Oracle Reports y el mismo esquema/DB link que ya usan esas tablas), los Page Items de la misma página y las constantes; si tiene errores, no cambia nada. Úselo en vez de «Nuevo proyecto desde DOCX» cuando el proyecto ya existe.</w:t>
             </w:r>
           </w:p>
         </w:tc>
@@ -4885,7 +4900,7 @@
                 <w:rFonts w:ascii="Aptos" w:hAnsi="Aptos"/>
                 <w:sz w:val="16"/>
               </w:rPr>
-              <w:t>Compilar</w:t>
+              <w:t>Validar</w:t>
             </w:r>
           </w:p>
         </w:tc>
@@ -4911,22 +4926,7 @@
                 <w:rFonts w:ascii="Aptos" w:hAnsi="Aptos"/>
                 <w:sz w:val="16"/>
               </w:rPr>
-              <w:t xml:space="preserve">Genera </w:t>
-            </w:r>
-            <w:r>
-              <w:rPr>
-                <w:rFonts w:ascii="Aptos" w:hAnsi="Aptos"/>
-                <w:b/>
-                <w:sz w:val="16"/>
-              </w:rPr>
-              <w:t>automáticamente</w:t>
-            </w:r>
-            <w:r>
-              <w:rPr>
-                <w:rFonts w:ascii="Aptos" w:hAnsi="Aptos"/>
-                <w:sz w:val="16"/>
-              </w:rPr>
-              <w:t xml:space="preserve"> apex_process.sql en proyectos\&lt;nombre&gt;\ y template.json y validation.json en generado\, y muestra qué subir a APEX y dónde: el package, la tabla de Page Items con su tipo sugerido, el botón, el proceso y la ruta exacta de apex_process.sql.</w:t>
+              <w:t>Revisa DOCX, SQL y proyecto sin escribir archivos y, si es válido, muestra los mismos pasos de APEX que Compilar y activa «Copiar código APEX».</w:t>
             </w:r>
           </w:p>
         </w:tc>
@@ -4957,7 +4957,7 @@
                 <w:rFonts w:ascii="Aptos" w:hAnsi="Aptos"/>
                 <w:sz w:val="16"/>
               </w:rPr>
-              <w:t>Copiar código APEX</w:t>
+              <w:t>Compilar</w:t>
             </w:r>
           </w:p>
         </w:tc>
@@ -4983,7 +4983,22 @@
                 <w:rFonts w:ascii="Aptos" w:hAnsi="Aptos"/>
                 <w:sz w:val="16"/>
               </w:rPr>
-              <w:t>Copia al portapapeles el bloque PL/SQL del proceso (el contenido de apex_process.sql), tras Validar o Compilar.</w:t>
+              <w:t xml:space="preserve">Genera </w:t>
+            </w:r>
+            <w:r>
+              <w:rPr>
+                <w:rFonts w:ascii="Aptos" w:hAnsi="Aptos"/>
+                <w:b/>
+                <w:sz w:val="16"/>
+              </w:rPr>
+              <w:t>automáticamente</w:t>
+            </w:r>
+            <w:r>
+              <w:rPr>
+                <w:rFonts w:ascii="Aptos" w:hAnsi="Aptos"/>
+                <w:sz w:val="16"/>
+              </w:rPr>
+              <w:t xml:space="preserve"> apex_process.sql en proyectos\&lt;nombre&gt;\ y template.json y validation.json en generado\, y muestra qué subir a APEX y dónde: el package, la tabla de Page Items con su tipo sugerido, el botón, el proceso y la ruta exacta de apex_process.sql.</w:t>
             </w:r>
           </w:p>
         </w:tc>
@@ -5014,7 +5029,7 @@
                 <w:rFonts w:ascii="Aptos" w:hAnsi="Aptos"/>
                 <w:sz w:val="16"/>
               </w:rPr>
-              <w:t>Abrir carpeta de salida</w:t>
+              <w:t>Administrar items y tablas…</w:t>
             </w:r>
           </w:p>
         </w:tc>
@@ -5040,7 +5055,37 @@
                 <w:rFonts w:ascii="Aptos" w:hAnsi="Aptos"/>
                 <w:sz w:val="16"/>
               </w:rPr>
-              <w:t>Abre proyectos\&lt;nombre&gt;\, donde está apex_process.sql.</w:t>
+              <w:t xml:space="preserve">Ventana con dos pestañas. </w:t>
+            </w:r>
+            <w:r>
+              <w:rPr>
+                <w:rFonts w:ascii="Aptos" w:hAnsi="Aptos"/>
+                <w:b/>
+                <w:sz w:val="16"/>
+              </w:rPr>
+              <w:t>Page Items</w:t>
+            </w:r>
+            <w:r>
+              <w:rPr>
+                <w:rFonts w:ascii="Aptos" w:hAnsi="Aptos"/>
+                <w:sz w:val="16"/>
+              </w:rPr>
+              <w:t xml:space="preserve">: muestra los items del proyecto y su uso; modo «Todos en una página» (escriba el número, por ejemplo 40, y todos los P30_… o PXX_… pasan a P40_…, con vista previa; los de la página 0 no cambian) o modo «Avanzado: uno por uno» (un campo por item). </w:t>
+            </w:r>
+            <w:r>
+              <w:rPr>
+                <w:rFonts w:ascii="Aptos" w:hAnsi="Aptos"/>
+                <w:b/>
+                <w:sz w:val="16"/>
+              </w:rPr>
+              <w:t>Tablas (FROM)</w:t>
+            </w:r>
+            <w:r>
+              <w:rPr>
+                <w:rFonts w:ascii="Aptos" w:hAnsi="Aptos"/>
+                <w:sz w:val="16"/>
+              </w:rPr>
+              <w:t>: lista cada tabla de los FROM/JOIN de las consultas y de las fórmulas de Oracle Reports, cómo está escrita y dónde se usa. Escriba arriba el esquema y el DB link (por ejemplo BDATOS y DL_11G) y pulse «Aplicar» en cada tabla que lo necesite, o «Aplicar a todas»; «Quitar» la deja sin esquema ni DB link. Se cambia en generado\q_*.sql y, para las fórmulas, en generado\codigo_reports\&lt;función&gt;.sql. Después pulse Compilar y vuelva a ejecutar el package en la base.</w:t>
             </w:r>
           </w:p>
         </w:tc>
@@ -5063,6 +5108,7 @@
           </w:tcPr>
           <w:p>
             <w:pPr>
+              <w:keepNext/>
               <w:spacing w:after="0"/>
             </w:pPr>
             <w:r>
@@ -5070,7 +5116,7 @@
                 <w:rFonts w:ascii="Aptos" w:hAnsi="Aptos"/>
                 <w:sz w:val="16"/>
               </w:rPr>
-              <w:t>Instrucciones APEX detalladas</w:t>
+              <w:t>Copiar código APEX</w:t>
             </w:r>
           </w:p>
         </w:tc>
@@ -5088,6 +5134,7 @@
           </w:tcPr>
           <w:p>
             <w:pPr>
+              <w:keepNext/>
               <w:spacing w:after="0"/>
             </w:pPr>
             <w:r>
@@ -5095,7 +5142,62 @@
                 <w:rFonts w:ascii="Aptos" w:hAnsi="Aptos"/>
                 <w:sz w:val="16"/>
               </w:rPr>
-              <w:t>Abre una ventana con la guía completa para el proyecto actual, según su modo (simple o layout): dónde se ejecuta cada SQL (SQL Scripts, SQL Developer con F5, SQL*Plus/SQLcl; nunca SQL Commands), qué se instala una sola vez y qué en cada compilación, qué va en la Page Global (página 0) y con qué valores, cada Page Item de la página con su tipo, el botón, el proceso y las pruebas. Tiene botones para copiar el código APEX y las instrucciones.</w:t>
+              <w:t>Copia al portapapeles el bloque PL/SQL del proceso (el contenido de apex_process.sql), tras Validar o Compilar, y abre la ventana «Dónde pegar el código APEX»: qué debe estar instalado antes, los Page Items, dónde se pega el proceso, cómo probar y qué hacer si falla. Desde esa ventana, el botón «Instrucciones APEX detalladas» abre la guía completa según el modo (simple o layout): dónde se ejecuta cada SQL (SQL Scripts, SQL Developer con F5, SQL*Plus/SQLcl; nunca SQL Commands), qué se instala una sola vez y qué en cada compilación, la Page Global (página 0), cada Page Item con su tipo, el botón, el proceso y las pruebas.</w:t>
+            </w:r>
+          </w:p>
+        </w:tc>
+      </w:tr>
+      <w:tr>
+        <w:trPr>
+          <w:cantSplit w:val="true"/>
+        </w:trPr>
+        <w:tc>
+          <w:tcPr>
+            <w:tcW w:type="dxa" w:w="4986"/>
+            <w:vAlign w:val="center"/>
+            <w:tcMar>
+              <w:top w:w="90" w:type="dxa"/>
+              <w:start w:w="110" w:type="dxa"/>
+              <w:bottom w:w="90" w:type="dxa"/>
+              <w:end w:w="110" w:type="dxa"/>
+            </w:tcMar>
+            <w:shd w:fill="FFFFFF"/>
+          </w:tcPr>
+          <w:p>
+            <w:pPr>
+              <w:spacing w:after="0"/>
+            </w:pPr>
+            <w:r>
+              <w:rPr>
+                <w:rFonts w:ascii="Aptos" w:hAnsi="Aptos"/>
+                <w:sz w:val="16"/>
+              </w:rPr>
+              <w:t>Abrir carpeta de salida</w:t>
+            </w:r>
+          </w:p>
+        </w:tc>
+        <w:tc>
+          <w:tcPr>
+            <w:tcW w:type="dxa" w:w="4986"/>
+            <w:vAlign w:val="center"/>
+            <w:tcMar>
+              <w:top w:w="90" w:type="dxa"/>
+              <w:start w:w="110" w:type="dxa"/>
+              <w:bottom w:w="90" w:type="dxa"/>
+              <w:end w:w="110" w:type="dxa"/>
+            </w:tcMar>
+            <w:shd w:fill="FFFFFF"/>
+          </w:tcPr>
+          <w:p>
+            <w:pPr>
+              <w:spacing w:after="0"/>
+            </w:pPr>
+            <w:r>
+              <w:rPr>
+                <w:rFonts w:ascii="Aptos" w:hAnsi="Aptos"/>
+                <w:sz w:val="16"/>
+              </w:rPr>
+              <w:t>Abre proyectos\&lt;nombre&gt;\, donde está apex_process.sql.</w:t>
             </w:r>
           </w:p>
         </w:tc>
@@ -12439,7 +12541,16 @@
         <w:t>When Button Pressed</w:t>
       </w:r>
       <w:r>
-        <w:t xml:space="preserve"> = el botón de descarga.</w:t>
+        <w:t xml:space="preserve"> = el botón de descarga. Si la página tiene varios botones de descarga, cree un proceso por reporte y seleccione en cada proceso únicamente su botón en </w:t>
+      </w:r>
+      <w:r>
+        <w:rPr>
+          <w:i/>
+        </w:rPr>
+        <w:t>When Button Pressed</w:t>
+      </w:r>
+      <w:r>
+        <w:t>. Así, al enviar la página, se genera solo el reporte solicitado.</w:t>
       </w:r>
     </w:p>
     <w:p>
@@ -21476,6 +21587,77 @@
       </w:r>
       <w:r>
         <w:t>, de modo que no se vuelve a convertir al compilar.</w:t>
+      </w:r>
+    </w:p>
+    <w:p>
+      <w:r>
+        <w:t xml:space="preserve">En el modo layout, la clave opcional </w:t>
+      </w:r>
+      <w:r>
+        <w:rPr>
+          <w:rFonts w:ascii="Consolas" w:hAnsi="Consolas"/>
+          <w:color w:val="233648"/>
+          <w:sz w:val="16"/>
+        </w:rPr>
+        <w:t>disposition</w:t>
+      </w:r>
+      <w:r>
+        <w:t xml:space="preserve"> del </w:t>
+      </w:r>
+      <w:r>
+        <w:rPr>
+          <w:rFonts w:ascii="Consolas" w:hAnsi="Consolas"/>
+          <w:color w:val="233648"/>
+          <w:sz w:val="16"/>
+        </w:rPr>
+        <w:t>.report.json</w:t>
+      </w:r>
+      <w:r>
+        <w:t xml:space="preserve"> define cómo entrega APEX el PDF: </w:t>
+      </w:r>
+      <w:r>
+        <w:rPr>
+          <w:rFonts w:ascii="Consolas" w:hAnsi="Consolas"/>
+          <w:color w:val="233648"/>
+          <w:sz w:val="16"/>
+        </w:rPr>
+        <w:t>"attachment"</w:t>
+      </w:r>
+      <w:r>
+        <w:t xml:space="preserve"> (predeterminado) lo descarga con el nombre de </w:t>
+      </w:r>
+      <w:r>
+        <w:rPr>
+          <w:rFonts w:ascii="Consolas" w:hAnsi="Consolas"/>
+          <w:color w:val="233648"/>
+          <w:sz w:val="16"/>
+        </w:rPr>
+        <w:t>file_name</w:t>
+      </w:r>
+      <w:r>
+        <w:t xml:space="preserve">; </w:t>
+      </w:r>
+      <w:r>
+        <w:rPr>
+          <w:rFonts w:ascii="Consolas" w:hAnsi="Consolas"/>
+          <w:color w:val="233648"/>
+          <w:sz w:val="16"/>
+        </w:rPr>
+        <w:t>"inline"</w:t>
+      </w:r>
+      <w:r>
+        <w:t xml:space="preserve"> lo abre en el navegador, pero entonces Chrome propone guardarlo como </w:t>
+      </w:r>
+      <w:r>
+        <w:rPr>
+          <w:rFonts w:ascii="Consolas" w:hAnsi="Consolas"/>
+          <w:color w:val="233648"/>
+          <w:sz w:val="16"/>
+        </w:rPr>
+        <w:t>wwv_flow.accept</w:t>
+      </w:r>
+      <w:r>
+        <w:t xml:space="preserve"> porque la página viene de un Submit. Después de cambiarla, pulse Compilar y vuelva a copiar el proceso en APEX.</w:t>
       </w:r>
     </w:p>
     <w:sectPr>

</xml_diff>